<commit_message>
Revise reports (v2): Chinese single-column, double-column EN, updated author affiliations, Roman numeral headings, paragraph limitations, future directions, table resizing
</commit_message>
<xml_diff>
--- a/SynBio final/reports/word/en/pdac_biosensor_report_en.docx
+++ b/SynBio final/reports/word/en/pdac_biosensor_report_en.docx
@@ -26,7 +26,7 @@
           <w:rFonts w:ascii="Times New Roman" w:hAnsi="Times New Roman"/>
           <w:sz w:val="24"/>
         </w:rPr>
-        <w:t>Chen-Jung Shih, Hsuan-Yu Liao, De-Fang Su, Chia-Yi Lin</w:t>
+        <w:t>SHIH, Chen-Jung¹, SU, Te-Fang¹, LIAO, Xuan-You², LIN, Chia-I²</w:t>
       </w:r>
     </w:p>
     <w:p>
@@ -39,9 +39,9 @@
           <w:rFonts w:ascii="Times New Roman" w:hAnsi="Times New Roman"/>
           <w:sz w:val="20"/>
         </w:rPr>
-        <w:t>Department of Synthetic Biology and Bioinformatics</w:t>
+        <w:t>¹Department of Life Science, National Taiwan University</w:t>
         <w:br/>
-        <w:t>National Center for High-Performance Computing (NCHC), Taiwan</w:t>
+        <w:t>²Department of Biochemical Science and Technology, National Taiwan University</w:t>
       </w:r>
     </w:p>
     <w:p>
@@ -103,7 +103,7 @@
           <w:b/>
           <w:sz w:val="36"/>
         </w:rPr>
-        <w:t>1. Introduction</w:t>
+        <w:t>I. Introduction</w:t>
       </w:r>
     </w:p>
     <w:p>
@@ -130,7 +130,7 @@
           <w:b/>
           <w:sz w:val="36"/>
         </w:rPr>
-        <w:t>2. Scientific Rationale and Unmet Need</w:t>
+        <w:t>II. Scientific Rationale and Unmet Need</w:t>
       </w:r>
     </w:p>
     <w:p>
@@ -157,7 +157,7 @@
           <w:b/>
           <w:sz w:val="36"/>
         </w:rPr>
-        <w:t>3. Data Sources</w:t>
+        <w:t>III. Data Sources</w:t>
       </w:r>
     </w:p>
     <w:p>
@@ -643,7 +643,7 @@
           <w:b/>
           <w:sz w:val="36"/>
         </w:rPr>
-        <w:t>4. Computational Pipeline</w:t>
+        <w:t>IV. Computational Pipeline</w:t>
       </w:r>
     </w:p>
     <w:p>
@@ -670,7 +670,7 @@
           <w:b/>
           <w:sz w:val="36"/>
         </w:rPr>
-        <w:t>5. Quality Control and Batch-Effect Assessment</w:t>
+        <w:t>V. Quality Control and Batch-Effect Assessment</w:t>
       </w:r>
     </w:p>
     <w:p>
@@ -697,7 +697,7 @@
           <w:b/>
           <w:sz w:val="36"/>
         </w:rPr>
-        <w:t>6. Differential Expression Analysis</w:t>
+        <w:t>VI. Differential Expression Analysis</w:t>
       </w:r>
     </w:p>
     <w:p>
@@ -2137,7 +2137,7 @@
           <w:b/>
           <w:sz w:val="36"/>
         </w:rPr>
-        <w:t>7. Machine Learning Classifier Performance</w:t>
+        <w:t>VII. Machine Learning Classifier Performance</w:t>
       </w:r>
     </w:p>
     <w:p>
@@ -2676,7 +2676,7 @@
           <w:b/>
           <w:sz w:val="36"/>
         </w:rPr>
-        <w:t>8. SHAP-Based Explainable AI Analysis</w:t>
+        <w:t>VIII. SHAP-Based Explainable AI Analysis</w:t>
       </w:r>
     </w:p>
     <w:p>
@@ -3738,7 +3738,7 @@
           <w:b/>
           <w:sz w:val="36"/>
         </w:rPr>
-        <w:t>9. Candidate Gene Pair Selection</w:t>
+        <w:t>IX. Candidate Gene Pair Selection</w:t>
       </w:r>
     </w:p>
     <w:p>
@@ -4277,7 +4277,7 @@
           <w:b/>
           <w:sz w:val="36"/>
         </w:rPr>
-        <w:t>10. Orthogonality Assessment</w:t>
+        <w:t>X. Orthogonality Assessment</w:t>
       </w:r>
     </w:p>
     <w:p>
@@ -4358,7 +4358,7 @@
           <w:b/>
           <w:sz w:val="36"/>
         </w:rPr>
-        <w:t>11. Need for Single-Cell and Spatial Validation</w:t>
+        <w:t>XI. Need for Single-Cell and Spatial Validation</w:t>
       </w:r>
     </w:p>
     <w:p>
@@ -4385,7 +4385,7 @@
           <w:b/>
           <w:sz w:val="36"/>
         </w:rPr>
-        <w:t>12. Hill-Equation-Based AND Gate Modeling</w:t>
+        <w:t>XII. Hill-Equation-Based AND Gate Modeling</w:t>
       </w:r>
     </w:p>
     <w:p>
@@ -4402,11 +4402,9 @@
         <w:t>The logic gate's response was modeled using a dual-input Hill equation:</w:t>
         <w:br/>
         <w:br/>
-        <w:t>\[</w:t>
         <w:br/>
-        <w:t>Output = P_{\text{basal}} + V_{\max} \left( \frac{[A]^n}{K_A^n + [A]^n} \right) \left( \frac{[B]^n}{K_B^n + [B]^n} \right)</w:t>
+        <w:t>Output = Pbasal + Vmax ( ([A]^n/KA^n + [A]^n) ) ( ([B]^n/KB^n + [B]^n) )</w:t>
         <w:br/>
-        <w:t>\]</w:t>
         <w:br/>
         <w:br/>
         <w:t>where [A] and [B] are the min-max scaled expressions of UBE2S and CCR6, K_A and K_B are the activation thresholds, n is the Hill coefficient (steepness), and P_{basal} is the leakiness. Parameter optimization via grid search determined the optimal settings: n = 1, P_{basal} = 0.0, K_A = 0.760 (for UBE2S), and K_B = 0.464 (for CCR6). The optimal output decision threshold was set to 0.25 to maximize AUC and classification accuracy.</w:t>
@@ -4422,7 +4420,7 @@
           <w:b/>
           <w:sz w:val="36"/>
         </w:rPr>
-        <w:t>13. In Silico Validation</w:t>
+        <w:t>XIII. In Silico Validation</w:t>
       </w:r>
     </w:p>
     <w:p>
@@ -5350,7 +5348,7 @@
           <w:b/>
           <w:sz w:val="36"/>
         </w:rPr>
-        <w:t>14. Robustness and Controls</w:t>
+        <w:t>XIV. Robustness and Controls</w:t>
       </w:r>
     </w:p>
     <w:p>
@@ -5377,146 +5375,7 @@
           <w:b/>
           <w:sz w:val="36"/>
         </w:rPr>
-        <w:t>15. Limitations</w:t>
-      </w:r>
-    </w:p>
-    <w:p>
-      <w:pPr>
-        <w:spacing w:after="80" w:line="360" w:lineRule="auto"/>
-      </w:pPr>
-      <w:r>
-        <w:rPr>
-          <w:rFonts w:ascii="Times New Roman" w:hAnsi="Times New Roman"/>
-          <w:b w:val="0"/>
-          <w:i w:val="0"/>
-          <w:sz w:val="24"/>
-        </w:rPr>
-        <w:t>- This is an in silico proof-of-concept; biochemical kinetics may differ.</w:t>
-      </w:r>
-    </w:p>
-    <w:p>
-      <w:pPr>
-        <w:spacing w:after="80" w:line="360" w:lineRule="auto"/>
-      </w:pPr>
-      <w:r>
-        <w:rPr>
-          <w:rFonts w:ascii="Times New Roman" w:hAnsi="Times New Roman"/>
-          <w:b w:val="0"/>
-          <w:i w:val="0"/>
-          <w:sz w:val="24"/>
-        </w:rPr>
-        <w:t>- SHAP-inferred thresholds are statistical inflection points and do not map directly to biochemical dissociation constants.</w:t>
-      </w:r>
-    </w:p>
-    <w:p>
-      <w:pPr>
-        <w:spacing w:after="80" w:line="360" w:lineRule="auto"/>
-      </w:pPr>
-      <w:r>
-        <w:rPr>
-          <w:rFonts w:ascii="Times New Roman" w:hAnsi="Times New Roman"/>
-          <w:b w:val="0"/>
-          <w:i w:val="0"/>
-          <w:sz w:val="24"/>
-        </w:rPr>
-        <w:t>- Bulk RNA-seq data reflects average cell populations and is highly influenced by stromal density and immune infiltration.</w:t>
-      </w:r>
-    </w:p>
-    <w:p>
-      <w:pPr>
-        <w:spacing w:after="80" w:line="360" w:lineRule="auto"/>
-      </w:pPr>
-      <w:r>
-        <w:rPr>
-          <w:rFonts w:ascii="Times New Roman" w:hAnsi="Times New Roman"/>
-          <w:b w:val="0"/>
-          <w:i w:val="0"/>
-          <w:sz w:val="24"/>
-        </w:rPr>
-        <w:t>- The comparison between TCGA (tumor) and GTEx (normal) may contain subtle batch effects despite TOIL harmonization.</w:t>
-      </w:r>
-    </w:p>
-    <w:p>
-      <w:pPr>
-        <w:spacing w:after="80" w:line="360" w:lineRule="auto"/>
-      </w:pPr>
-      <w:r>
-        <w:rPr>
-          <w:rFonts w:ascii="Times New Roman" w:hAnsi="Times New Roman"/>
-          <w:b w:val="0"/>
-          <w:i w:val="0"/>
-          <w:sz w:val="24"/>
-        </w:rPr>
-        <w:t>- External validation cohort demonstrated extremely low sensitivity (4.3%), indicating significant challenge in threshold transfer.</w:t>
-      </w:r>
-    </w:p>
-    <w:p>
-      <w:pPr>
-        <w:spacing w:after="80" w:line="360" w:lineRule="auto"/>
-      </w:pPr>
-      <w:r>
-        <w:rPr>
-          <w:rFonts w:ascii="Times New Roman" w:hAnsi="Times New Roman"/>
-          <w:b w:val="0"/>
-          <w:i w:val="0"/>
-          <w:sz w:val="24"/>
-        </w:rPr>
-        <w:t>- The selected candidate pair (UBE2S + CCR6) is not strictly statistically orthogonal, exhibiting a correlation of 0.714.</w:t>
-      </w:r>
-    </w:p>
-    <w:p>
-      <w:pPr>
-        <w:spacing w:after="80" w:line="360" w:lineRule="auto"/>
-      </w:pPr>
-      <w:r>
-        <w:rPr>
-          <w:rFonts w:ascii="Times New Roman" w:hAnsi="Times New Roman"/>
-          <w:b w:val="0"/>
-          <w:i w:val="0"/>
-          <w:sz w:val="24"/>
-        </w:rPr>
-        <w:t>- Transcriptomic abundance differences do not guarantee equivalent sensor accessibility or protein translation.</w:t>
-      </w:r>
-    </w:p>
-    <w:p>
-      <w:pPr>
-        <w:spacing w:after="80" w:line="360" w:lineRule="auto"/>
-      </w:pPr>
-      <w:r>
-        <w:rPr>
-          <w:rFonts w:ascii="Times New Roman" w:hAnsi="Times New Roman"/>
-          <w:b w:val="0"/>
-          <w:i w:val="0"/>
-          <w:sz w:val="24"/>
-        </w:rPr>
-        <w:t>- The final candidates require promoter engineering or RNA sensor design, which introduces additional complexity.</w:t>
-      </w:r>
-    </w:p>
-    <w:p>
-      <w:pPr>
-        <w:spacing w:after="80" w:line="360" w:lineRule="auto"/>
-      </w:pPr>
-      <w:r>
-        <w:rPr>
-          <w:rFonts w:ascii="Times New Roman" w:hAnsi="Times New Roman"/>
-          <w:b w:val="0"/>
-          <w:i w:val="0"/>
-          <w:sz w:val="24"/>
-        </w:rPr>
-        <w:t>- Any diagnostic or therapeutic application requires extensive wet-lab validation and safety testing in model organisms.</w:t>
-      </w:r>
-    </w:p>
-    <w:p>
-      <w:pPr>
-        <w:spacing w:before="240" w:after="120"/>
-      </w:pPr>
-      <w:r>
-        <w:rPr>
-          <w:rFonts w:ascii="Arial" w:hAnsi="Arial"/>
-          <w:b/>
-          <w:sz w:val="36"/>
-        </w:rPr>
-        <w:t>16. Proposed Wet-Lab Validation</w:t>
+        <w:t>XV. Limitations</w:t>
       </w:r>
     </w:p>
     <w:p>
@@ -5530,7 +5389,7 @@
           <w:i w:val="0"/>
           <w:sz w:val="24"/>
         </w:rPr>
-        <w:t>To validate this AND-gate biosensor in vitro, we propose a synthetic notch (synNotch) or synthetic promoter construct. The promoter regions driving UBE2S and CCR6 will be cloned upstream of two orthogonal transcription factors (e.g., tTA and LhG4). These factors will cooperatively drive a split-transactivator system, activating a green fluorescent protein (GFP) reporter or therapeutic payload (e.g., Diphtheria toxin A) only when both promoters are active. Testing should be performed on PDAC cell lines (e.g., PANC-1, MIA PaCa-2) as positive controls and normal human pancreatic duct epithelial cells (HPDE) as negative controls, followed by in vivo validation in tumor xenograft mouse models.</w:t>
+        <w:t>Several critical limitations must be acknowledged. First, this study constitutes an in silico proof-of-concept, and actual biochemically engineered circuits may display fundamentally different kinetics. Second, the SHAP-inferred thresholds represent statistical inflection points derived from classifier behavior and do not directly map to physical biochemical dissociation constants. Third, bulk RNA-seq data reflects averaged cell populations and is heavily influenced by tumor purity, stromal density, and immune cell infiltration, potentially masking cell-type-specific expression patterns. Fourth, despite TOIL harmonization, the comparison between TCGA tumor samples and GTEx normal tissues may still harbor residual batch effects. Fifth, the external validation cohort demonstrated extremely low sensitivity (4.3%), highlighting a significant challenge in cross-platform threshold transfer from RNA-seq to microarray data. Sixth, the selected candidate pair (UBE2S + CCR6) is not strictly statistically orthogonal, exhibiting a Spearman correlation of 0.714 in bulk data. Seventh, transcriptomic abundance does not guarantee equivalent sensor accessibility or protein-level expression. Eighth, translating these candidates into a functional synthetic circuit requires promoter engineering or RNA-based sensor design, each introducing additional layers of design complexity. Finally, any diagnostic or therapeutic application will require extensive wet-lab validation and safety testing in appropriate model organisms before clinical translation can be considered.</w:t>
       </w:r>
     </w:p>
     <w:p>
@@ -5543,7 +5402,34 @@
           <w:b/>
           <w:sz w:val="36"/>
         </w:rPr>
-        <w:t>17. Conclusion</w:t>
+        <w:t>XVI. Future Experimental Directions</w:t>
+      </w:r>
+    </w:p>
+    <w:p>
+      <w:pPr>
+        <w:spacing w:after="120" w:line="360" w:lineRule="auto"/>
+      </w:pPr>
+      <w:r>
+        <w:rPr>
+          <w:rFonts w:ascii="Times New Roman" w:hAnsi="Times New Roman"/>
+          <w:b w:val="0"/>
+          <w:i w:val="0"/>
+          <w:sz w:val="24"/>
+        </w:rPr>
+        <w:t>Several experimental avenues merit exploration to translate the computational findings of this study into functional synthetic biology constructs. One promising direction involves the engineering of synthetic promoter systems, wherein the upstream regulatory regions of UBE2S and CCR6 would be cloned to drive orthogonal transcription factors (e.g., tTA and LhG4) in a split-transactivator configuration, enabling AND-gate logic at the transcriptional level. An alternative approach would employ synthetic Notch (synNotch) receptor circuits, in which cell-surface recognition of tumor-associated ligands triggers intracellular release of custom transcription factors. Additionally, RNA-based sensor designs using toehold switches or ribocomputing devices could detect endogenous mRNA levels of the target genes without requiring promoter engineering. Functional validation should be conducted in PDAC cell lines (e.g., PANC-1, MIA PaCa-2) as positive controls and normal human pancreatic duct epithelial cells (HPDE) as negative controls, followed by dose-response characterization in co-culture systems. Longer-term directions include in vivo validation using patient-derived xenograft (PDX) mouse models, assessment of circuit stability under metabolic stress, and exploration of multi-input logic gates (e.g., three-input AND or AND-NOT) to further improve tumor specificity and reduce off-target activation.</w:t>
+      </w:r>
+    </w:p>
+    <w:p>
+      <w:pPr>
+        <w:spacing w:before="240" w:after="120"/>
+      </w:pPr>
+      <w:r>
+        <w:rPr>
+          <w:rFonts w:ascii="Arial" w:hAnsi="Arial"/>
+          <w:b/>
+          <w:sz w:val="36"/>
+        </w:rPr>
+        <w:t>XVII. Conclusion</w:t>
       </w:r>
     </w:p>
     <w:p>
@@ -5570,7 +5456,7 @@
           <w:b/>
           <w:sz w:val="36"/>
         </w:rPr>
-        <w:t>18. References</w:t>
+        <w:t>XVIII. References</w:t>
       </w:r>
     </w:p>
     <w:p>
@@ -5658,7 +5544,7 @@
           <w:b/>
           <w:sz w:val="36"/>
         </w:rPr>
-        <w:t>19. Supplementary Tables and Figures</w:t>
+        <w:t>XIX. Supplementary Tables and Figures</w:t>
       </w:r>
     </w:p>
     <w:p>

</xml_diff>